<commit_message>
Correct IP1 checklist testing results
</commit_message>
<xml_diff>
--- a/Design Evaluation/Design Evaluation 1 Filled Out.docx
+++ b/Design Evaluation/Design Evaluation 1 Filled Out.docx
@@ -807,7 +807,7 @@
           <w:color w:val="000000"/>
           <w:sz w:val="16"/>
         </w:rPr>
-        <w:t>P1, P2, and P3 consented to audio recording and have full transcript PDFs. P4 and P5 were recorded with checklists only.</w:t>
+        <w:t>P1, P2, and P3 consented to audio recording and have full transcript PDFs. P4 and P5 completed checklist-only sessions, were not audio recorded, and each scored 5 out of 5.</w:t>
       </w:r>
     </w:p>
     <w:tbl>
@@ -1402,10 +1402,10 @@
             <w:tcW w:type="dxa" w:w="792"/>
             <w:vAlign w:val="center"/>
             <w:tcMar>
-              <w:top w:w="45" w:type="dxa"/>
-              <w:start w:w="65" w:type="dxa"/>
-              <w:bottom w:w="45" w:type="dxa"/>
-              <w:end w:w="65" w:type="dxa"/>
+              <w:top w:w="55" w:type="dxa"/>
+              <w:start w:w="55" w:type="dxa"/>
+              <w:bottom w:w="55" w:type="dxa"/>
+              <w:end w:w="55" w:type="dxa"/>
             </w:tcMar>
           </w:tcPr>
           <w:p>
@@ -1429,10 +1429,10 @@
             <w:tcW w:type="dxa" w:w="1584"/>
             <w:vAlign w:val="center"/>
             <w:tcMar>
-              <w:top w:w="45" w:type="dxa"/>
-              <w:start w:w="65" w:type="dxa"/>
-              <w:bottom w:w="45" w:type="dxa"/>
-              <w:end w:w="65" w:type="dxa"/>
+              <w:top w:w="55" w:type="dxa"/>
+              <w:start w:w="55" w:type="dxa"/>
+              <w:bottom w:w="55" w:type="dxa"/>
+              <w:end w:w="55" w:type="dxa"/>
             </w:tcMar>
           </w:tcPr>
           <w:p>
@@ -1456,10 +1456,10 @@
             <w:tcW w:type="dxa" w:w="2880"/>
             <w:vAlign w:val="center"/>
             <w:tcMar>
-              <w:top w:w="45" w:type="dxa"/>
-              <w:start w:w="65" w:type="dxa"/>
-              <w:bottom w:w="45" w:type="dxa"/>
-              <w:end w:w="65" w:type="dxa"/>
+              <w:top w:w="55" w:type="dxa"/>
+              <w:start w:w="55" w:type="dxa"/>
+              <w:bottom w:w="55" w:type="dxa"/>
+              <w:end w:w="55" w:type="dxa"/>
             </w:tcMar>
           </w:tcPr>
           <w:p>
@@ -1483,10 +1483,10 @@
             <w:tcW w:type="dxa" w:w="4248"/>
             <w:vAlign w:val="center"/>
             <w:tcMar>
-              <w:top w:w="45" w:type="dxa"/>
-              <w:start w:w="65" w:type="dxa"/>
-              <w:bottom w:w="45" w:type="dxa"/>
-              <w:end w:w="65" w:type="dxa"/>
+              <w:top w:w="55" w:type="dxa"/>
+              <w:start w:w="55" w:type="dxa"/>
+              <w:bottom w:w="55" w:type="dxa"/>
+              <w:end w:w="55" w:type="dxa"/>
             </w:tcMar>
           </w:tcPr>
           <w:p>
@@ -1512,10 +1512,10 @@
             <w:tcW w:type="dxa" w:w="792"/>
             <w:vAlign w:val="center"/>
             <w:tcMar>
-              <w:top w:w="45" w:type="dxa"/>
-              <w:start w:w="65" w:type="dxa"/>
-              <w:bottom w:w="45" w:type="dxa"/>
-              <w:end w:w="65" w:type="dxa"/>
+              <w:top w:w="55" w:type="dxa"/>
+              <w:start w:w="55" w:type="dxa"/>
+              <w:bottom w:w="55" w:type="dxa"/>
+              <w:end w:w="55" w:type="dxa"/>
             </w:tcMar>
           </w:tcPr>
           <w:p>
@@ -1539,10 +1539,10 @@
             <w:tcW w:type="dxa" w:w="1584"/>
             <w:vAlign w:val="center"/>
             <w:tcMar>
-              <w:top w:w="45" w:type="dxa"/>
-              <w:start w:w="65" w:type="dxa"/>
-              <w:bottom w:w="45" w:type="dxa"/>
-              <w:end w:w="65" w:type="dxa"/>
+              <w:top w:w="55" w:type="dxa"/>
+              <w:start w:w="55" w:type="dxa"/>
+              <w:bottom w:w="55" w:type="dxa"/>
+              <w:end w:w="55" w:type="dxa"/>
             </w:tcMar>
           </w:tcPr>
           <w:p>
@@ -1566,10 +1566,10 @@
             <w:tcW w:type="dxa" w:w="2880"/>
             <w:vAlign w:val="center"/>
             <w:tcMar>
-              <w:top w:w="45" w:type="dxa"/>
-              <w:start w:w="65" w:type="dxa"/>
-              <w:bottom w:w="45" w:type="dxa"/>
-              <w:end w:w="65" w:type="dxa"/>
+              <w:top w:w="55" w:type="dxa"/>
+              <w:start w:w="55" w:type="dxa"/>
+              <w:bottom w:w="55" w:type="dxa"/>
+              <w:end w:w="55" w:type="dxa"/>
             </w:tcMar>
           </w:tcPr>
           <w:p>
@@ -1593,10 +1593,10 @@
             <w:tcW w:type="dxa" w:w="4248"/>
             <w:vAlign w:val="center"/>
             <w:tcMar>
-              <w:top w:w="45" w:type="dxa"/>
-              <w:start w:w="65" w:type="dxa"/>
-              <w:bottom w:w="45" w:type="dxa"/>
-              <w:end w:w="65" w:type="dxa"/>
+              <w:top w:w="55" w:type="dxa"/>
+              <w:start w:w="55" w:type="dxa"/>
+              <w:bottom w:w="55" w:type="dxa"/>
+              <w:end w:w="55" w:type="dxa"/>
             </w:tcMar>
           </w:tcPr>
           <w:p>
@@ -1622,10 +1622,10 @@
             <w:tcW w:type="dxa" w:w="792"/>
             <w:vAlign w:val="center"/>
             <w:tcMar>
-              <w:top w:w="45" w:type="dxa"/>
-              <w:start w:w="65" w:type="dxa"/>
-              <w:bottom w:w="45" w:type="dxa"/>
-              <w:end w:w="65" w:type="dxa"/>
+              <w:top w:w="55" w:type="dxa"/>
+              <w:start w:w="55" w:type="dxa"/>
+              <w:bottom w:w="55" w:type="dxa"/>
+              <w:end w:w="55" w:type="dxa"/>
             </w:tcMar>
           </w:tcPr>
           <w:p>
@@ -1649,10 +1649,10 @@
             <w:tcW w:type="dxa" w:w="1584"/>
             <w:vAlign w:val="center"/>
             <w:tcMar>
-              <w:top w:w="45" w:type="dxa"/>
-              <w:start w:w="65" w:type="dxa"/>
-              <w:bottom w:w="45" w:type="dxa"/>
-              <w:end w:w="65" w:type="dxa"/>
+              <w:top w:w="55" w:type="dxa"/>
+              <w:start w:w="55" w:type="dxa"/>
+              <w:bottom w:w="55" w:type="dxa"/>
+              <w:end w:w="55" w:type="dxa"/>
             </w:tcMar>
           </w:tcPr>
           <w:p>
@@ -1676,10 +1676,10 @@
             <w:tcW w:type="dxa" w:w="2880"/>
             <w:vAlign w:val="center"/>
             <w:tcMar>
-              <w:top w:w="45" w:type="dxa"/>
-              <w:start w:w="65" w:type="dxa"/>
-              <w:bottom w:w="45" w:type="dxa"/>
-              <w:end w:w="65" w:type="dxa"/>
+              <w:top w:w="55" w:type="dxa"/>
+              <w:start w:w="55" w:type="dxa"/>
+              <w:bottom w:w="55" w:type="dxa"/>
+              <w:end w:w="55" w:type="dxa"/>
             </w:tcMar>
           </w:tcPr>
           <w:p>
@@ -1703,10 +1703,10 @@
             <w:tcW w:type="dxa" w:w="4248"/>
             <w:vAlign w:val="center"/>
             <w:tcMar>
-              <w:top w:w="45" w:type="dxa"/>
-              <w:start w:w="65" w:type="dxa"/>
-              <w:bottom w:w="45" w:type="dxa"/>
-              <w:end w:w="65" w:type="dxa"/>
+              <w:top w:w="55" w:type="dxa"/>
+              <w:start w:w="55" w:type="dxa"/>
+              <w:bottom w:w="55" w:type="dxa"/>
+              <w:end w:w="55" w:type="dxa"/>
             </w:tcMar>
           </w:tcPr>
           <w:p>
@@ -1732,10 +1732,10 @@
             <w:tcW w:type="dxa" w:w="792"/>
             <w:vAlign w:val="center"/>
             <w:tcMar>
-              <w:top w:w="45" w:type="dxa"/>
-              <w:start w:w="65" w:type="dxa"/>
-              <w:bottom w:w="45" w:type="dxa"/>
-              <w:end w:w="65" w:type="dxa"/>
+              <w:top w:w="55" w:type="dxa"/>
+              <w:start w:w="55" w:type="dxa"/>
+              <w:bottom w:w="55" w:type="dxa"/>
+              <w:end w:w="55" w:type="dxa"/>
             </w:tcMar>
           </w:tcPr>
           <w:p>
@@ -1759,10 +1759,10 @@
             <w:tcW w:type="dxa" w:w="1584"/>
             <w:vAlign w:val="center"/>
             <w:tcMar>
-              <w:top w:w="45" w:type="dxa"/>
-              <w:start w:w="65" w:type="dxa"/>
-              <w:bottom w:w="45" w:type="dxa"/>
-              <w:end w:w="65" w:type="dxa"/>
+              <w:top w:w="55" w:type="dxa"/>
+              <w:start w:w="55" w:type="dxa"/>
+              <w:bottom w:w="55" w:type="dxa"/>
+              <w:end w:w="55" w:type="dxa"/>
             </w:tcMar>
           </w:tcPr>
           <w:p>
@@ -1786,10 +1786,10 @@
             <w:tcW w:type="dxa" w:w="2880"/>
             <w:vAlign w:val="center"/>
             <w:tcMar>
-              <w:top w:w="45" w:type="dxa"/>
-              <w:start w:w="65" w:type="dxa"/>
-              <w:bottom w:w="45" w:type="dxa"/>
-              <w:end w:w="65" w:type="dxa"/>
+              <w:top w:w="55" w:type="dxa"/>
+              <w:start w:w="55" w:type="dxa"/>
+              <w:bottom w:w="55" w:type="dxa"/>
+              <w:end w:w="55" w:type="dxa"/>
             </w:tcMar>
           </w:tcPr>
           <w:p>
@@ -1813,10 +1813,10 @@
             <w:tcW w:type="dxa" w:w="4248"/>
             <w:vAlign w:val="center"/>
             <w:tcMar>
-              <w:top w:w="45" w:type="dxa"/>
-              <w:start w:w="65" w:type="dxa"/>
-              <w:bottom w:w="45" w:type="dxa"/>
-              <w:end w:w="65" w:type="dxa"/>
+              <w:top w:w="55" w:type="dxa"/>
+              <w:start w:w="55" w:type="dxa"/>
+              <w:bottom w:w="55" w:type="dxa"/>
+              <w:end w:w="55" w:type="dxa"/>
             </w:tcMar>
           </w:tcPr>
           <w:p>
@@ -1842,10 +1842,10 @@
             <w:tcW w:type="dxa" w:w="792"/>
             <w:vAlign w:val="center"/>
             <w:tcMar>
-              <w:top w:w="45" w:type="dxa"/>
-              <w:start w:w="65" w:type="dxa"/>
-              <w:bottom w:w="45" w:type="dxa"/>
-              <w:end w:w="65" w:type="dxa"/>
+              <w:top w:w="55" w:type="dxa"/>
+              <w:start w:w="55" w:type="dxa"/>
+              <w:bottom w:w="55" w:type="dxa"/>
+              <w:end w:w="55" w:type="dxa"/>
             </w:tcMar>
           </w:tcPr>
           <w:p>
@@ -1869,10 +1869,10 @@
             <w:tcW w:type="dxa" w:w="1584"/>
             <w:vAlign w:val="center"/>
             <w:tcMar>
-              <w:top w:w="45" w:type="dxa"/>
-              <w:start w:w="65" w:type="dxa"/>
-              <w:bottom w:w="45" w:type="dxa"/>
-              <w:end w:w="65" w:type="dxa"/>
+              <w:top w:w="55" w:type="dxa"/>
+              <w:start w:w="55" w:type="dxa"/>
+              <w:bottom w:w="55" w:type="dxa"/>
+              <w:end w:w="55" w:type="dxa"/>
             </w:tcMar>
           </w:tcPr>
           <w:p>
@@ -1896,10 +1896,10 @@
             <w:tcW w:type="dxa" w:w="2880"/>
             <w:vAlign w:val="center"/>
             <w:tcMar>
-              <w:top w:w="45" w:type="dxa"/>
-              <w:start w:w="65" w:type="dxa"/>
-              <w:bottom w:w="45" w:type="dxa"/>
-              <w:end w:w="65" w:type="dxa"/>
+              <w:top w:w="55" w:type="dxa"/>
+              <w:start w:w="55" w:type="dxa"/>
+              <w:bottom w:w="55" w:type="dxa"/>
+              <w:end w:w="55" w:type="dxa"/>
             </w:tcMar>
           </w:tcPr>
           <w:p>
@@ -1912,9 +1912,9 @@
                 <w:rFonts w:ascii="Arial" w:hAnsi="Arial"/>
                 <w:b w:val="0"/>
                 <w:color w:val="000000"/>
-                <w:sz w:val="13"/>
+                <w:sz w:val="15"/>
               </w:rPr>
-              <w:t>Completed all core tasks and was satisfied.</w:t>
+              <w:t>Completed all core tasks. Confidence 5 out of 5.</w:t>
             </w:r>
           </w:p>
         </w:tc>
@@ -1923,10 +1923,10 @@
             <w:tcW w:type="dxa" w:w="4248"/>
             <w:vAlign w:val="center"/>
             <w:tcMar>
-              <w:top w:w="45" w:type="dxa"/>
-              <w:start w:w="65" w:type="dxa"/>
-              <w:bottom w:w="45" w:type="dxa"/>
-              <w:end w:w="65" w:type="dxa"/>
+              <w:top w:w="55" w:type="dxa"/>
+              <w:start w:w="55" w:type="dxa"/>
+              <w:bottom w:w="55" w:type="dxa"/>
+              <w:end w:w="55" w:type="dxa"/>
             </w:tcMar>
           </w:tcPr>
           <w:p>
@@ -1939,9 +1939,9 @@
                 <w:rFonts w:ascii="Arial" w:hAnsi="Arial"/>
                 <w:b w:val="0"/>
                 <w:color w:val="000000"/>
-                <w:sz w:val="13"/>
+                <w:sz w:val="15"/>
               </w:rPr>
-              <w:t>No full transcript or quote was created.</w:t>
+              <w:t>Checklist only, no audio recording. Shared feedback: very useful for students who are easily distracted in online class and good for homeschooling.</w:t>
             </w:r>
           </w:p>
         </w:tc>
@@ -1952,10 +1952,10 @@
             <w:tcW w:type="dxa" w:w="792"/>
             <w:vAlign w:val="center"/>
             <w:tcMar>
-              <w:top w:w="45" w:type="dxa"/>
-              <w:start w:w="65" w:type="dxa"/>
-              <w:bottom w:w="45" w:type="dxa"/>
-              <w:end w:w="65" w:type="dxa"/>
+              <w:top w:w="55" w:type="dxa"/>
+              <w:start w:w="55" w:type="dxa"/>
+              <w:bottom w:w="55" w:type="dxa"/>
+              <w:end w:w="55" w:type="dxa"/>
             </w:tcMar>
           </w:tcPr>
           <w:p>
@@ -1979,10 +1979,10 @@
             <w:tcW w:type="dxa" w:w="1584"/>
             <w:vAlign w:val="center"/>
             <w:tcMar>
-              <w:top w:w="45" w:type="dxa"/>
-              <w:start w:w="65" w:type="dxa"/>
-              <w:bottom w:w="45" w:type="dxa"/>
-              <w:end w:w="65" w:type="dxa"/>
+              <w:top w:w="55" w:type="dxa"/>
+              <w:start w:w="55" w:type="dxa"/>
+              <w:bottom w:w="55" w:type="dxa"/>
+              <w:end w:w="55" w:type="dxa"/>
             </w:tcMar>
           </w:tcPr>
           <w:p>
@@ -2006,10 +2006,10 @@
             <w:tcW w:type="dxa" w:w="2880"/>
             <w:vAlign w:val="center"/>
             <w:tcMar>
-              <w:top w:w="45" w:type="dxa"/>
-              <w:start w:w="65" w:type="dxa"/>
-              <w:bottom w:w="45" w:type="dxa"/>
-              <w:end w:w="65" w:type="dxa"/>
+              <w:top w:w="55" w:type="dxa"/>
+              <w:start w:w="55" w:type="dxa"/>
+              <w:bottom w:w="55" w:type="dxa"/>
+              <w:end w:w="55" w:type="dxa"/>
             </w:tcMar>
           </w:tcPr>
           <w:p>
@@ -2022,9 +2022,9 @@
                 <w:rFonts w:ascii="Arial" w:hAnsi="Arial"/>
                 <w:b w:val="0"/>
                 <w:color w:val="000000"/>
-                <w:sz w:val="13"/>
+                <w:sz w:val="15"/>
               </w:rPr>
-              <w:t>Completed all core tasks and was satisfied.</w:t>
+              <w:t>Completed all core tasks. Confidence 5 out of 5.</w:t>
             </w:r>
           </w:p>
         </w:tc>
@@ -2033,10 +2033,10 @@
             <w:tcW w:type="dxa" w:w="4248"/>
             <w:vAlign w:val="center"/>
             <w:tcMar>
-              <w:top w:w="45" w:type="dxa"/>
-              <w:start w:w="65" w:type="dxa"/>
-              <w:bottom w:w="45" w:type="dxa"/>
-              <w:end w:w="65" w:type="dxa"/>
+              <w:top w:w="55" w:type="dxa"/>
+              <w:start w:w="55" w:type="dxa"/>
+              <w:bottom w:w="55" w:type="dxa"/>
+              <w:end w:w="55" w:type="dxa"/>
             </w:tcMar>
           </w:tcPr>
           <w:p>
@@ -2049,9 +2049,9 @@
                 <w:rFonts w:ascii="Arial" w:hAnsi="Arial"/>
                 <w:b w:val="0"/>
                 <w:color w:val="000000"/>
-                <w:sz w:val="13"/>
+                <w:sz w:val="15"/>
               </w:rPr>
-              <w:t>No full transcript or quote was created.</w:t>
+              <w:t>Checklist only, no audio recording. Shared feedback: very useful for students who are easily distracted in online class and good for homeschooling.</w:t>
             </w:r>
           </w:p>
         </w:tc>
@@ -2131,7 +2131,7 @@
           <w:color w:val="000000"/>
           <w:sz w:val="16"/>
         </w:rPr>
-        <w:t>P1 and P2 needed to move closer or look more carefully before seeing the table tools. P3 also needed to inspect the table tools before using them.</w:t>
+        <w:t>All five participants found the table tools hard to read or notice at first. Several needed to move closer or inspect the menu before using it.</w:t>
       </w:r>
     </w:p>
     <w:p>
@@ -2161,7 +2161,7 @@
           <w:color w:val="000000"/>
           <w:sz w:val="16"/>
         </w:rPr>
-        <w:t>Participants described the idea as useful for students who lose focus during online classes and for homeschooling because it can feel like a classroom.</w:t>
+        <w:t>All five participants described the idea as useful for students who lose focus during online classes and for homeschooling. P4 and P5 also wrote that it was very useful for students who are easily distracted in online class and good for homeschooling.</w:t>
       </w:r>
     </w:p>
     <w:p>
@@ -2205,10 +2205,10 @@
             <w:tcW w:type="dxa" w:w="1872"/>
             <w:vAlign w:val="center"/>
             <w:tcMar>
-              <w:top w:w="45" w:type="dxa"/>
-              <w:start w:w="65" w:type="dxa"/>
-              <w:bottom w:w="45" w:type="dxa"/>
-              <w:end w:w="65" w:type="dxa"/>
+              <w:top w:w="55" w:type="dxa"/>
+              <w:start w:w="55" w:type="dxa"/>
+              <w:bottom w:w="55" w:type="dxa"/>
+              <w:end w:w="55" w:type="dxa"/>
             </w:tcMar>
           </w:tcPr>
           <w:p>
@@ -2232,10 +2232,10 @@
             <w:tcW w:type="dxa" w:w="4680"/>
             <w:vAlign w:val="center"/>
             <w:tcMar>
-              <w:top w:w="45" w:type="dxa"/>
-              <w:start w:w="65" w:type="dxa"/>
-              <w:bottom w:w="45" w:type="dxa"/>
-              <w:end w:w="65" w:type="dxa"/>
+              <w:top w:w="55" w:type="dxa"/>
+              <w:start w:w="55" w:type="dxa"/>
+              <w:bottom w:w="55" w:type="dxa"/>
+              <w:end w:w="55" w:type="dxa"/>
             </w:tcMar>
           </w:tcPr>
           <w:p>
@@ -2259,10 +2259,10 @@
             <w:tcW w:type="dxa" w:w="2952"/>
             <w:vAlign w:val="center"/>
             <w:tcMar>
-              <w:top w:w="45" w:type="dxa"/>
-              <w:start w:w="65" w:type="dxa"/>
-              <w:bottom w:w="45" w:type="dxa"/>
-              <w:end w:w="65" w:type="dxa"/>
+              <w:top w:w="55" w:type="dxa"/>
+              <w:start w:w="55" w:type="dxa"/>
+              <w:bottom w:w="55" w:type="dxa"/>
+              <w:end w:w="55" w:type="dxa"/>
             </w:tcMar>
           </w:tcPr>
           <w:p>
@@ -2288,10 +2288,10 @@
             <w:tcW w:type="dxa" w:w="1872"/>
             <w:vAlign w:val="center"/>
             <w:tcMar>
-              <w:top w:w="45" w:type="dxa"/>
-              <w:start w:w="65" w:type="dxa"/>
-              <w:bottom w:w="45" w:type="dxa"/>
-              <w:end w:w="65" w:type="dxa"/>
+              <w:top w:w="55" w:type="dxa"/>
+              <w:start w:w="55" w:type="dxa"/>
+              <w:bottom w:w="55" w:type="dxa"/>
+              <w:end w:w="55" w:type="dxa"/>
             </w:tcMar>
           </w:tcPr>
           <w:p>
@@ -2315,10 +2315,10 @@
             <w:tcW w:type="dxa" w:w="4680"/>
             <w:vAlign w:val="center"/>
             <w:tcMar>
-              <w:top w:w="45" w:type="dxa"/>
-              <w:start w:w="65" w:type="dxa"/>
-              <w:bottom w:w="45" w:type="dxa"/>
-              <w:end w:w="65" w:type="dxa"/>
+              <w:top w:w="55" w:type="dxa"/>
+              <w:start w:w="55" w:type="dxa"/>
+              <w:bottom w:w="55" w:type="dxa"/>
+              <w:end w:w="55" w:type="dxa"/>
             </w:tcMar>
           </w:tcPr>
           <w:p>
@@ -2331,9 +2331,9 @@
                 <w:rFonts w:ascii="Arial" w:hAnsi="Arial"/>
                 <w:b w:val="0"/>
                 <w:color w:val="000000"/>
-                <w:sz w:val="13"/>
+                <w:sz w:val="15"/>
               </w:rPr>
-              <w:t>Participants connected the classroom, whiteboard, and paper to studying, online learning, focus, and homeschooling.</w:t>
+              <w:t>All five participants connected the classroom, whiteboard, and paper to studying, online learning, focus, and homeschooling.</w:t>
             </w:r>
           </w:p>
         </w:tc>
@@ -2342,10 +2342,10 @@
             <w:tcW w:type="dxa" w:w="2952"/>
             <w:vAlign w:val="center"/>
             <w:tcMar>
-              <w:top w:w="45" w:type="dxa"/>
-              <w:start w:w="65" w:type="dxa"/>
-              <w:bottom w:w="45" w:type="dxa"/>
-              <w:end w:w="65" w:type="dxa"/>
+              <w:top w:w="55" w:type="dxa"/>
+              <w:start w:w="55" w:type="dxa"/>
+              <w:bottom w:w="55" w:type="dxa"/>
+              <w:end w:w="55" w:type="dxa"/>
             </w:tcMar>
           </w:tcPr>
           <w:p>
@@ -2371,10 +2371,10 @@
             <w:tcW w:type="dxa" w:w="1872"/>
             <w:vAlign w:val="center"/>
             <w:tcMar>
-              <w:top w:w="45" w:type="dxa"/>
-              <w:start w:w="65" w:type="dxa"/>
-              <w:bottom w:w="45" w:type="dxa"/>
-              <w:end w:w="65" w:type="dxa"/>
+              <w:top w:w="55" w:type="dxa"/>
+              <w:start w:w="55" w:type="dxa"/>
+              <w:bottom w:w="55" w:type="dxa"/>
+              <w:end w:w="55" w:type="dxa"/>
             </w:tcMar>
           </w:tcPr>
           <w:p>
@@ -2398,10 +2398,10 @@
             <w:tcW w:type="dxa" w:w="4680"/>
             <w:vAlign w:val="center"/>
             <w:tcMar>
-              <w:top w:w="45" w:type="dxa"/>
-              <w:start w:w="65" w:type="dxa"/>
-              <w:bottom w:w="45" w:type="dxa"/>
-              <w:end w:w="65" w:type="dxa"/>
+              <w:top w:w="55" w:type="dxa"/>
+              <w:start w:w="55" w:type="dxa"/>
+              <w:bottom w:w="55" w:type="dxa"/>
+              <w:end w:w="55" w:type="dxa"/>
             </w:tcMar>
           </w:tcPr>
           <w:p>
@@ -2425,10 +2425,10 @@
             <w:tcW w:type="dxa" w:w="2952"/>
             <w:vAlign w:val="center"/>
             <w:tcMar>
-              <w:top w:w="45" w:type="dxa"/>
-              <w:start w:w="65" w:type="dxa"/>
-              <w:bottom w:w="45" w:type="dxa"/>
-              <w:end w:w="65" w:type="dxa"/>
+              <w:top w:w="55" w:type="dxa"/>
+              <w:start w:w="55" w:type="dxa"/>
+              <w:bottom w:w="55" w:type="dxa"/>
+              <w:end w:w="55" w:type="dxa"/>
             </w:tcMar>
           </w:tcPr>
           <w:p>
@@ -2454,10 +2454,10 @@
             <w:tcW w:type="dxa" w:w="1872"/>
             <w:vAlign w:val="center"/>
             <w:tcMar>
-              <w:top w:w="45" w:type="dxa"/>
-              <w:start w:w="65" w:type="dxa"/>
-              <w:bottom w:w="45" w:type="dxa"/>
-              <w:end w:w="65" w:type="dxa"/>
+              <w:top w:w="55" w:type="dxa"/>
+              <w:start w:w="55" w:type="dxa"/>
+              <w:bottom w:w="55" w:type="dxa"/>
+              <w:end w:w="55" w:type="dxa"/>
             </w:tcMar>
           </w:tcPr>
           <w:p>
@@ -2481,10 +2481,10 @@
             <w:tcW w:type="dxa" w:w="4680"/>
             <w:vAlign w:val="center"/>
             <w:tcMar>
-              <w:top w:w="45" w:type="dxa"/>
-              <w:start w:w="65" w:type="dxa"/>
-              <w:bottom w:w="45" w:type="dxa"/>
-              <w:end w:w="65" w:type="dxa"/>
+              <w:top w:w="55" w:type="dxa"/>
+              <w:start w:w="55" w:type="dxa"/>
+              <w:bottom w:w="55" w:type="dxa"/>
+              <w:end w:w="55" w:type="dxa"/>
             </w:tcMar>
           </w:tcPr>
           <w:p>
@@ -2497,9 +2497,9 @@
                 <w:rFonts w:ascii="Arial" w:hAnsi="Arial"/>
                 <w:b w:val="0"/>
                 <w:color w:val="000000"/>
-                <w:sz w:val="13"/>
+                <w:sz w:val="15"/>
               </w:rPr>
-              <w:t>P1, P2, and P3 needed closer inspection or movement before using the table tools.</w:t>
+              <w:t>All five participants found the table tools hard to read or notice at first.</w:t>
             </w:r>
           </w:p>
         </w:tc>
@@ -2508,10 +2508,10 @@
             <w:tcW w:type="dxa" w:w="2952"/>
             <w:vAlign w:val="center"/>
             <w:tcMar>
-              <w:top w:w="45" w:type="dxa"/>
-              <w:start w:w="65" w:type="dxa"/>
-              <w:bottom w:w="45" w:type="dxa"/>
-              <w:end w:w="65" w:type="dxa"/>
+              <w:top w:w="55" w:type="dxa"/>
+              <w:start w:w="55" w:type="dxa"/>
+              <w:bottom w:w="55" w:type="dxa"/>
+              <w:end w:w="55" w:type="dxa"/>
             </w:tcMar>
           </w:tcPr>
           <w:p>
@@ -2537,10 +2537,10 @@
             <w:tcW w:type="dxa" w:w="1872"/>
             <w:vAlign w:val="center"/>
             <w:tcMar>
-              <w:top w:w="45" w:type="dxa"/>
-              <w:start w:w="65" w:type="dxa"/>
-              <w:bottom w:w="45" w:type="dxa"/>
-              <w:end w:w="65" w:type="dxa"/>
+              <w:top w:w="55" w:type="dxa"/>
+              <w:start w:w="55" w:type="dxa"/>
+              <w:bottom w:w="55" w:type="dxa"/>
+              <w:end w:w="55" w:type="dxa"/>
             </w:tcMar>
           </w:tcPr>
           <w:p>
@@ -2564,10 +2564,10 @@
             <w:tcW w:type="dxa" w:w="4680"/>
             <w:vAlign w:val="center"/>
             <w:tcMar>
-              <w:top w:w="45" w:type="dxa"/>
-              <w:start w:w="65" w:type="dxa"/>
-              <w:bottom w:w="45" w:type="dxa"/>
-              <w:end w:w="65" w:type="dxa"/>
+              <w:top w:w="55" w:type="dxa"/>
+              <w:start w:w="55" w:type="dxa"/>
+              <w:bottom w:w="55" w:type="dxa"/>
+              <w:end w:w="55" w:type="dxa"/>
             </w:tcMar>
           </w:tcPr>
           <w:p>
@@ -2591,10 +2591,10 @@
             <w:tcW w:type="dxa" w:w="2952"/>
             <w:vAlign w:val="center"/>
             <w:tcMar>
-              <w:top w:w="45" w:type="dxa"/>
-              <w:start w:w="65" w:type="dxa"/>
-              <w:bottom w:w="45" w:type="dxa"/>
-              <w:end w:w="65" w:type="dxa"/>
+              <w:top w:w="55" w:type="dxa"/>
+              <w:start w:w="55" w:type="dxa"/>
+              <w:bottom w:w="55" w:type="dxa"/>
+              <w:end w:w="55" w:type="dxa"/>
             </w:tcMar>
           </w:tcPr>
           <w:p>
@@ -2620,10 +2620,10 @@
             <w:tcW w:type="dxa" w:w="1872"/>
             <w:vAlign w:val="center"/>
             <w:tcMar>
-              <w:top w:w="45" w:type="dxa"/>
-              <w:start w:w="65" w:type="dxa"/>
-              <w:bottom w:w="45" w:type="dxa"/>
-              <w:end w:w="65" w:type="dxa"/>
+              <w:top w:w="55" w:type="dxa"/>
+              <w:start w:w="55" w:type="dxa"/>
+              <w:bottom w:w="55" w:type="dxa"/>
+              <w:end w:w="55" w:type="dxa"/>
             </w:tcMar>
           </w:tcPr>
           <w:p>
@@ -2647,10 +2647,10 @@
             <w:tcW w:type="dxa" w:w="4680"/>
             <w:vAlign w:val="center"/>
             <w:tcMar>
-              <w:top w:w="45" w:type="dxa"/>
-              <w:start w:w="65" w:type="dxa"/>
-              <w:bottom w:w="45" w:type="dxa"/>
-              <w:end w:w="65" w:type="dxa"/>
+              <w:top w:w="55" w:type="dxa"/>
+              <w:start w:w="55" w:type="dxa"/>
+              <w:bottom w:w="55" w:type="dxa"/>
+              <w:end w:w="55" w:type="dxa"/>
             </w:tcMar>
           </w:tcPr>
           <w:p>
@@ -2674,10 +2674,10 @@
             <w:tcW w:type="dxa" w:w="2952"/>
             <w:vAlign w:val="center"/>
             <w:tcMar>
-              <w:top w:w="45" w:type="dxa"/>
-              <w:start w:w="65" w:type="dxa"/>
-              <w:bottom w:w="45" w:type="dxa"/>
-              <w:end w:w="65" w:type="dxa"/>
+              <w:top w:w="55" w:type="dxa"/>
+              <w:start w:w="55" w:type="dxa"/>
+              <w:bottom w:w="55" w:type="dxa"/>
+              <w:end w:w="55" w:type="dxa"/>
             </w:tcMar>
           </w:tcPr>
           <w:p>
@@ -3968,10 +3968,10 @@
             <w:tcW w:type="dxa" w:w="3816"/>
             <w:vAlign w:val="center"/>
             <w:tcMar>
-              <w:top w:w="45" w:type="dxa"/>
-              <w:start w:w="65" w:type="dxa"/>
-              <w:bottom w:w="45" w:type="dxa"/>
-              <w:end w:w="65" w:type="dxa"/>
+              <w:top w:w="55" w:type="dxa"/>
+              <w:start w:w="55" w:type="dxa"/>
+              <w:bottom w:w="55" w:type="dxa"/>
+              <w:end w:w="55" w:type="dxa"/>
             </w:tcMar>
           </w:tcPr>
           <w:p>
@@ -3984,9 +3984,9 @@
                 <w:rFonts w:ascii="Arial" w:hAnsi="Arial"/>
                 <w:b w:val="0"/>
                 <w:color w:val="000000"/>
-                <w:sz w:val="13"/>
+                <w:sz w:val="15"/>
               </w:rPr>
-              <w:t>P4 and P5 checklist-only notes</w:t>
+              <w:t>P4 and P5 checklist notes, no audio recording</w:t>
             </w:r>
           </w:p>
         </w:tc>
@@ -3995,10 +3995,10 @@
             <w:tcW w:type="dxa" w:w="5688"/>
             <w:vAlign w:val="center"/>
             <w:tcMar>
-              <w:top w:w="45" w:type="dxa"/>
-              <w:start w:w="65" w:type="dxa"/>
-              <w:bottom w:w="45" w:type="dxa"/>
-              <w:end w:w="65" w:type="dxa"/>
+              <w:top w:w="55" w:type="dxa"/>
+              <w:start w:w="55" w:type="dxa"/>
+              <w:bottom w:w="55" w:type="dxa"/>
+              <w:end w:w="55" w:type="dxa"/>
             </w:tcMar>
           </w:tcPr>
           <w:p>
@@ -4011,7 +4011,7 @@
                 <w:rFonts w:ascii="Arial" w:hAnsi="Arial"/>
                 <w:b w:val="0"/>
                 <w:color w:val="000000"/>
-                <w:sz w:val="13"/>
+                <w:sz w:val="15"/>
               </w:rPr>
               <w:t>Stored in Participant04-05_Checklist.md</w:t>
             </w:r>
@@ -4145,9 +4145,9 @@
         <w:rPr>
           <w:rFonts w:ascii="Arial" w:hAnsi="Arial"/>
           <w:color w:val="000000"/>
-          <w:sz w:val="17"/>
+          <w:sz w:val="16"/>
         </w:rPr>
-        <w:t>The evidence supports the IP1 aim, but the paper drawing issue and table tool visibility should be tested again after the next changes. This report does not invent transcripts or quotes for the two checklist-only sessions.</w:t>
+        <w:t>The evidence supports the IP1 aim, but the paper drawing issue and table tool visibility should be tested again after the next changes. P4 and P5 were not audio recorded. Their checklist notes include a written shared comment, but no full audio transcript is claimed.</w:t>
       </w:r>
     </w:p>
     <w:sectPr>

</xml_diff>